<commit_message>
docs: atualiza documentos Word de considerações finais e guia de teste
Co-Authored-By: Claude Opus 5 (1M context) <noreply@anthropic.com>
</commit_message>
<xml_diff>
--- a/docs/Consideracoes-finais-Prancheto-IA.docx
+++ b/docs/Consideracoes-finais-Prancheto-IA.docx
@@ -15,8 +15,17 @@
           <w:rFonts w:ascii="Calibri" w:eastAsia="Times New Roman" w:hAnsi="Calibri" w:cs="Calibri"/>
           <w:lang w:val="pt-BR"/>
         </w:rPr>
-        <w:t>Considerações finais — Prancheto.IA</w:t>
-      </w:r>
+        <w:t xml:space="preserve">Considerações finais — </w:t>
+      </w:r>
+      <w:proofErr w:type="spellStart"/>
+      <w:r>
+        <w:rPr>
+          <w:rFonts w:ascii="Calibri" w:eastAsia="Times New Roman" w:hAnsi="Calibri" w:cs="Calibri"/>
+          <w:lang w:val="pt-BR"/>
+        </w:rPr>
+        <w:t>Prancheto.IA</w:t>
+      </w:r>
+      <w:proofErr w:type="spellEnd"/>
     </w:p>
     <w:p>
       <w:pPr>
@@ -136,7 +145,29 @@
           <w:szCs w:val="22"/>
           <w:lang w:val="pt-BR"/>
         </w:rPr>
-        <w:t xml:space="preserve"> 41 de 41 tabelas com RLS habilitado, 109 policies, todas amarradas a tenant ou usuário. As duas exceções (</w:t>
+        <w:t xml:space="preserve"> 41 de 41 tabelas com RLS habilitado, 109 policies, todas amarradas a </w:t>
+      </w:r>
+      <w:proofErr w:type="spellStart"/>
+      <w:r>
+        <w:rPr>
+          <w:rFonts w:ascii="Calibri" w:eastAsia="Times New Roman" w:hAnsi="Calibri" w:cs="Calibri"/>
+          <w:color w:val="1A1A1A"/>
+          <w:sz w:val="22"/>
+          <w:szCs w:val="22"/>
+          <w:lang w:val="pt-BR"/>
+        </w:rPr>
+        <w:t>tenant</w:t>
+      </w:r>
+      <w:proofErr w:type="spellEnd"/>
+      <w:r>
+        <w:rPr>
+          <w:rFonts w:ascii="Calibri" w:eastAsia="Times New Roman" w:hAnsi="Calibri" w:cs="Calibri"/>
+          <w:color w:val="1A1A1A"/>
+          <w:sz w:val="22"/>
+          <w:szCs w:val="22"/>
+          <w:lang w:val="pt-BR"/>
+        </w:rPr>
+        <w:t xml:space="preserve"> ou usuário. As duas exceções (</w:t>
       </w:r>
       <w:r>
         <w:rPr>
@@ -156,6 +187,7 @@
         </w:rPr>
         <w:t xml:space="preserve">, </w:t>
       </w:r>
+      <w:proofErr w:type="spellStart"/>
       <w:r>
         <w:rPr>
           <w:rStyle w:val="CdigoHTML"/>
@@ -164,6 +196,7 @@
         </w:rPr>
         <w:t>recursos_plano</w:t>
       </w:r>
+      <w:proofErr w:type="spellEnd"/>
       <w:r>
         <w:rPr>
           <w:rFonts w:ascii="Calibri" w:eastAsia="Times New Roman" w:hAnsi="Calibri" w:cs="Calibri"/>
@@ -248,7 +281,29 @@
           <w:szCs w:val="22"/>
           <w:lang w:val="pt-BR"/>
         </w:rPr>
-        <w:t>, conferida no bundle publicado e não no painel.</w:t>
+        <w:t xml:space="preserve">, conferida no </w:t>
+      </w:r>
+      <w:proofErr w:type="spellStart"/>
+      <w:r>
+        <w:rPr>
+          <w:rFonts w:ascii="Calibri" w:eastAsia="Times New Roman" w:hAnsi="Calibri" w:cs="Calibri"/>
+          <w:color w:val="1A1A1A"/>
+          <w:sz w:val="22"/>
+          <w:szCs w:val="22"/>
+          <w:lang w:val="pt-BR"/>
+        </w:rPr>
+        <w:t>bundle</w:t>
+      </w:r>
+      <w:proofErr w:type="spellEnd"/>
+      <w:r>
+        <w:rPr>
+          <w:rFonts w:ascii="Calibri" w:eastAsia="Times New Roman" w:hAnsi="Calibri" w:cs="Calibri"/>
+          <w:color w:val="1A1A1A"/>
+          <w:sz w:val="22"/>
+          <w:szCs w:val="22"/>
+          <w:lang w:val="pt-BR"/>
+        </w:rPr>
+        <w:t xml:space="preserve"> publicado e não no painel.</w:t>
       </w:r>
     </w:p>
     <w:p>
@@ -266,6 +321,7 @@
           <w:lang w:val="pt-BR"/>
         </w:rPr>
       </w:pPr>
+      <w:proofErr w:type="spellStart"/>
       <w:r>
         <w:rPr>
           <w:rFonts w:ascii="Calibri" w:eastAsia="Times New Roman" w:hAnsi="Calibri" w:cs="Calibri"/>
@@ -276,17 +332,66 @@
           <w:szCs w:val="22"/>
           <w:lang w:val="pt-BR"/>
         </w:rPr>
-        <w:t>Migrations versionadas</w:t>
-      </w:r>
-      <w:r>
-        <w:rPr>
-          <w:rFonts w:ascii="Calibri" w:eastAsia="Times New Roman" w:hAnsi="Calibri" w:cs="Calibri"/>
-          <w:color w:val="1A1A1A"/>
-          <w:sz w:val="22"/>
-          <w:szCs w:val="22"/>
-          <w:lang w:val="pt-BR"/>
-        </w:rPr>
-        <w:t>, com histórico reconciliado e fluxo dev → produção funcionando.</w:t>
+        <w:t>Migrations</w:t>
+      </w:r>
+      <w:proofErr w:type="spellEnd"/>
+      <w:r>
+        <w:rPr>
+          <w:rFonts w:ascii="Calibri" w:eastAsia="Times New Roman" w:hAnsi="Calibri" w:cs="Calibri"/>
+          <w:b/>
+          <w:bCs/>
+          <w:color w:val="1A1A1A"/>
+          <w:sz w:val="22"/>
+          <w:szCs w:val="22"/>
+          <w:lang w:val="pt-BR"/>
+        </w:rPr>
+        <w:t xml:space="preserve"> </w:t>
+      </w:r>
+      <w:proofErr w:type="spellStart"/>
+      <w:r>
+        <w:rPr>
+          <w:rFonts w:ascii="Calibri" w:eastAsia="Times New Roman" w:hAnsi="Calibri" w:cs="Calibri"/>
+          <w:b/>
+          <w:bCs/>
+          <w:color w:val="1A1A1A"/>
+          <w:sz w:val="22"/>
+          <w:szCs w:val="22"/>
+          <w:lang w:val="pt-BR"/>
+        </w:rPr>
+        <w:t>versionadas</w:t>
+      </w:r>
+      <w:proofErr w:type="spellEnd"/>
+      <w:r>
+        <w:rPr>
+          <w:rFonts w:ascii="Calibri" w:eastAsia="Times New Roman" w:hAnsi="Calibri" w:cs="Calibri"/>
+          <w:color w:val="1A1A1A"/>
+          <w:sz w:val="22"/>
+          <w:szCs w:val="22"/>
+          <w:lang w:val="pt-BR"/>
+        </w:rPr>
+        <w:t xml:space="preserve">, com histórico reconciliado e fluxo </w:t>
+      </w:r>
+      <w:proofErr w:type="spellStart"/>
+      <w:r>
+        <w:rPr>
+          <w:rFonts w:ascii="Calibri" w:eastAsia="Times New Roman" w:hAnsi="Calibri" w:cs="Calibri"/>
+          <w:color w:val="1A1A1A"/>
+          <w:sz w:val="22"/>
+          <w:szCs w:val="22"/>
+          <w:lang w:val="pt-BR"/>
+        </w:rPr>
+        <w:t>dev</w:t>
+      </w:r>
+      <w:proofErr w:type="spellEnd"/>
+      <w:r>
+        <w:rPr>
+          <w:rFonts w:ascii="Calibri" w:eastAsia="Times New Roman" w:hAnsi="Calibri" w:cs="Calibri"/>
+          <w:color w:val="1A1A1A"/>
+          <w:sz w:val="22"/>
+          <w:szCs w:val="22"/>
+          <w:lang w:val="pt-BR"/>
+        </w:rPr>
+        <w:t xml:space="preserve"> → produção funcionando.</w:t>
       </w:r>
     </w:p>
     <w:p>
@@ -314,7 +419,33 @@
           <w:szCs w:val="22"/>
           <w:lang w:val="pt-BR"/>
         </w:rPr>
-        <w:t>Nenhum segredo versionado.</w:t>
+        <w:t xml:space="preserve">Nenhum segredo </w:t>
+      </w:r>
+      <w:proofErr w:type="spellStart"/>
+      <w:r>
+        <w:rPr>
+          <w:rFonts w:ascii="Calibri" w:eastAsia="Times New Roman" w:hAnsi="Calibri" w:cs="Calibri"/>
+          <w:b/>
+          <w:bCs/>
+          <w:color w:val="1A1A1A"/>
+          <w:sz w:val="22"/>
+          <w:szCs w:val="22"/>
+          <w:lang w:val="pt-BR"/>
+        </w:rPr>
+        <w:t>versionado</w:t>
+      </w:r>
+      <w:proofErr w:type="spellEnd"/>
+      <w:r>
+        <w:rPr>
+          <w:rFonts w:ascii="Calibri" w:eastAsia="Times New Roman" w:hAnsi="Calibri" w:cs="Calibri"/>
+          <w:b/>
+          <w:bCs/>
+          <w:color w:val="1A1A1A"/>
+          <w:sz w:val="22"/>
+          <w:szCs w:val="22"/>
+          <w:lang w:val="pt-BR"/>
+        </w:rPr>
+        <w:t>.</w:t>
       </w:r>
     </w:p>
     <w:p>
@@ -336,7 +467,29 @@
           <w:szCs w:val="22"/>
           <w:lang w:val="pt-BR"/>
         </w:rPr>
-        <w:t>Uma base multi-tenant com isolamento correto em 18 mil linhas não é comum. O alicerce está de pé.</w:t>
+        <w:t xml:space="preserve">Uma base </w:t>
+      </w:r>
+      <w:proofErr w:type="spellStart"/>
+      <w:r>
+        <w:rPr>
+          <w:rFonts w:ascii="Calibri" w:hAnsi="Calibri" w:cs="Calibri"/>
+          <w:color w:val="1A1A1A"/>
+          <w:sz w:val="22"/>
+          <w:szCs w:val="22"/>
+          <w:lang w:val="pt-BR"/>
+        </w:rPr>
+        <w:t>multi-tenant</w:t>
+      </w:r>
+      <w:proofErr w:type="spellEnd"/>
+      <w:r>
+        <w:rPr>
+          <w:rFonts w:ascii="Calibri" w:hAnsi="Calibri" w:cs="Calibri"/>
+          <w:color w:val="1A1A1A"/>
+          <w:sz w:val="22"/>
+          <w:szCs w:val="22"/>
+          <w:lang w:val="pt-BR"/>
+        </w:rPr>
+        <w:t xml:space="preserve"> com isolamento correto em 18 mil linhas não é comum. O alicerce está de pé.</w:t>
       </w:r>
     </w:p>
     <w:p>
@@ -352,7 +505,21 @@
           <w:rFonts w:ascii="Calibri" w:eastAsia="Times New Roman" w:hAnsi="Calibri" w:cs="Calibri"/>
           <w:lang w:val="pt-BR"/>
         </w:rPr>
-        <w:t>O que impede vender</w:t>
+        <w:t>O que impede</w:t>
+      </w:r>
+      <w:r>
+        <w:rPr>
+          <w:rFonts w:ascii="Calibri" w:eastAsia="Times New Roman" w:hAnsi="Calibri" w:cs="Calibri"/>
+          <w:lang w:val="pt-BR"/>
+        </w:rPr>
+        <w:t xml:space="preserve"> de</w:t>
+      </w:r>
+      <w:r>
+        <w:rPr>
+          <w:rFonts w:ascii="Calibri" w:eastAsia="Times New Roman" w:hAnsi="Calibri" w:cs="Calibri"/>
+          <w:lang w:val="pt-BR"/>
+        </w:rPr>
+        <w:t xml:space="preserve"> vender</w:t>
       </w:r>
     </w:p>
     <w:p>
@@ -410,7 +577,33 @@
           <w:szCs w:val="22"/>
           <w:lang w:val="pt-BR"/>
         </w:rPr>
-        <w:t>2. O lint achou um crash na primeira execução.</w:t>
+        <w:t xml:space="preserve">2. O </w:t>
+      </w:r>
+      <w:proofErr w:type="spellStart"/>
+      <w:r>
+        <w:rPr>
+          <w:rFonts w:ascii="Calibri" w:hAnsi="Calibri" w:cs="Calibri"/>
+          <w:b/>
+          <w:bCs/>
+          <w:color w:val="1A1A1A"/>
+          <w:sz w:val="22"/>
+          <w:szCs w:val="22"/>
+          <w:lang w:val="pt-BR"/>
+        </w:rPr>
+        <w:t>lint</w:t>
+      </w:r>
+      <w:proofErr w:type="spellEnd"/>
+      <w:r>
+        <w:rPr>
+          <w:rFonts w:ascii="Calibri" w:hAnsi="Calibri" w:cs="Calibri"/>
+          <w:b/>
+          <w:bCs/>
+          <w:color w:val="1A1A1A"/>
+          <w:sz w:val="22"/>
+          <w:szCs w:val="22"/>
+          <w:lang w:val="pt-BR"/>
+        </w:rPr>
+        <w:t xml:space="preserve"> achou um crash na primeira execução.</w:t>
       </w:r>
       <w:r>
         <w:rPr>
@@ -422,14 +615,70 @@
         </w:rPr>
         <w:t xml:space="preserve"> </w:t>
       </w:r>
+      <w:proofErr w:type="spellStart"/>
       <w:r>
         <w:rPr>
           <w:rStyle w:val="CdigoHTML"/>
           <w:color w:val="1A1A1A"/>
           <w:lang w:val="pt-BR"/>
         </w:rPr>
-        <w:t>conversationId is not defined</w:t>
-      </w:r>
+        <w:t>conversationId</w:t>
+      </w:r>
+      <w:proofErr w:type="spellEnd"/>
+      <w:r>
+        <w:rPr>
+          <w:rStyle w:val="CdigoHTML"/>
+          <w:color w:val="1A1A1A"/>
+          <w:lang w:val="pt-BR"/>
+        </w:rPr>
+        <w:t xml:space="preserve"> </w:t>
+      </w:r>
+      <w:proofErr w:type="spellStart"/>
+      <w:r>
+        <w:rPr>
+          <w:rStyle w:val="CdigoHTML"/>
+          <w:color w:val="1A1A1A"/>
+          <w:lang w:val="pt-BR"/>
+        </w:rPr>
+        <w:t>is</w:t>
+      </w:r>
+      <w:proofErr w:type="spellEnd"/>
+      <w:r>
+        <w:rPr>
+          <w:rStyle w:val="CdigoHTML"/>
+          <w:color w:val="1A1A1A"/>
+          <w:lang w:val="pt-BR"/>
+        </w:rPr>
+        <w:t xml:space="preserve"> </w:t>
+      </w:r>
+      <w:proofErr w:type="spellStart"/>
+      <w:r>
+        <w:rPr>
+          <w:rStyle w:val="CdigoHTML"/>
+          <w:color w:val="1A1A1A"/>
+          <w:lang w:val="pt-BR"/>
+        </w:rPr>
+        <w:t>not</w:t>
+      </w:r>
+      <w:proofErr w:type="spellEnd"/>
+      <w:r>
+        <w:rPr>
+          <w:rStyle w:val="CdigoHTML"/>
+          <w:color w:val="1A1A1A"/>
+          <w:lang w:val="pt-BR"/>
+        </w:rPr>
+        <w:t xml:space="preserve"> </w:t>
+      </w:r>
+      <w:proofErr w:type="spellStart"/>
+      <w:r>
+        <w:rPr>
+          <w:rStyle w:val="CdigoHTML"/>
+          <w:color w:val="1A1A1A"/>
+          <w:lang w:val="pt-BR"/>
+        </w:rPr>
+        <w:t>defined</w:t>
+      </w:r>
+      <w:proofErr w:type="spellEnd"/>
       <w:r>
         <w:rPr>
           <w:rFonts w:ascii="Calibri" w:hAnsi="Calibri" w:cs="Calibri"/>
@@ -440,6 +689,7 @@
         </w:rPr>
         <w:t xml:space="preserve"> no Chat IA do Super Admin: </w:t>
       </w:r>
+      <w:proofErr w:type="spellStart"/>
       <w:r>
         <w:rPr>
           <w:rStyle w:val="CdigoHTML"/>
@@ -448,6 +698,7 @@
         </w:rPr>
         <w:t>ReferenceError</w:t>
       </w:r>
+      <w:proofErr w:type="spellEnd"/>
       <w:r>
         <w:rPr>
           <w:rFonts w:ascii="Calibri" w:hAnsi="Calibri" w:cs="Calibri"/>
@@ -474,17 +725,7 @@
           <w:szCs w:val="22"/>
           <w:lang w:val="pt-BR"/>
         </w:rPr>
-        <w:t xml:space="preserve"> genérico como "Erro ao enviar mensagem". Aquele chat </w:t>
-      </w:r>
-      <w:r>
-        <w:rPr>
-          <w:rFonts w:ascii="Calibri" w:hAnsi="Calibri" w:cs="Calibri"/>
-          <w:color w:val="1A1A1A"/>
-          <w:sz w:val="22"/>
-          <w:szCs w:val="22"/>
-          <w:lang w:val="pt-BR"/>
-        </w:rPr>
-        <w:t>nunca funcionou. Corrigi. O que preocupa não é o bug, é o que ele indica sobre o que ainda não foi olhado.</w:t>
+        <w:t xml:space="preserve"> genérico como "Erro ao enviar mensagem". Aquele chat nunca funcionou. Corrigi. O que preocupa não é o bug, é o que ele indica sobre o que ainda não foi olhado.</w:t>
       </w:r>
     </w:p>
     <w:p>
@@ -518,7 +759,29 @@
           <w:szCs w:val="22"/>
           <w:lang w:val="pt-BR"/>
         </w:rPr>
-        <w:t xml:space="preserve"> O Sentry está codificado, mas </w:t>
+        <w:t xml:space="preserve"> O </w:t>
+      </w:r>
+      <w:proofErr w:type="spellStart"/>
+      <w:r>
+        <w:rPr>
+          <w:rFonts w:ascii="Calibri" w:hAnsi="Calibri" w:cs="Calibri"/>
+          <w:color w:val="1A1A1A"/>
+          <w:sz w:val="22"/>
+          <w:szCs w:val="22"/>
+          <w:lang w:val="pt-BR"/>
+        </w:rPr>
+        <w:t>Sentry</w:t>
+      </w:r>
+      <w:proofErr w:type="spellEnd"/>
+      <w:r>
+        <w:rPr>
+          <w:rFonts w:ascii="Calibri" w:hAnsi="Calibri" w:cs="Calibri"/>
+          <w:color w:val="1A1A1A"/>
+          <w:sz w:val="22"/>
+          <w:szCs w:val="22"/>
+          <w:lang w:val="pt-BR"/>
+        </w:rPr>
+        <w:t xml:space="preserve"> está codificado, mas </w:t>
       </w:r>
       <w:r>
         <w:rPr>
@@ -570,7 +833,51 @@
           <w:szCs w:val="22"/>
           <w:lang w:val="pt-BR"/>
         </w:rPr>
-        <w:t xml:space="preserve"> Não há workflow no GitHub Actions. Build e lint só rodam se alguém lembrar.</w:t>
+        <w:t xml:space="preserve"> Não há workflow no GitHub </w:t>
+      </w:r>
+      <w:proofErr w:type="spellStart"/>
+      <w:r>
+        <w:rPr>
+          <w:rFonts w:ascii="Calibri" w:hAnsi="Calibri" w:cs="Calibri"/>
+          <w:color w:val="1A1A1A"/>
+          <w:sz w:val="22"/>
+          <w:szCs w:val="22"/>
+          <w:lang w:val="pt-BR"/>
+        </w:rPr>
+        <w:t>Actions</w:t>
+      </w:r>
+      <w:proofErr w:type="spellEnd"/>
+      <w:r>
+        <w:rPr>
+          <w:rFonts w:ascii="Calibri" w:hAnsi="Calibri" w:cs="Calibri"/>
+          <w:color w:val="1A1A1A"/>
+          <w:sz w:val="22"/>
+          <w:szCs w:val="22"/>
+          <w:lang w:val="pt-BR"/>
+        </w:rPr>
+        <w:t xml:space="preserve">. Build e </w:t>
+      </w:r>
+      <w:proofErr w:type="spellStart"/>
+      <w:r>
+        <w:rPr>
+          <w:rFonts w:ascii="Calibri" w:hAnsi="Calibri" w:cs="Calibri"/>
+          <w:color w:val="1A1A1A"/>
+          <w:sz w:val="22"/>
+          <w:szCs w:val="22"/>
+          <w:lang w:val="pt-BR"/>
+        </w:rPr>
+        <w:t>lint</w:t>
+      </w:r>
+      <w:proofErr w:type="spellEnd"/>
+      <w:r>
+        <w:rPr>
+          <w:rFonts w:ascii="Calibri" w:hAnsi="Calibri" w:cs="Calibri"/>
+          <w:color w:val="1A1A1A"/>
+          <w:sz w:val="22"/>
+          <w:szCs w:val="22"/>
+          <w:lang w:val="pt-BR"/>
+        </w:rPr>
+        <w:t xml:space="preserve"> só rodam se alguém lembrar.</w:t>
       </w:r>
     </w:p>
     <w:p>
@@ -604,17 +911,7 @@
           <w:szCs w:val="22"/>
           <w:lang w:val="pt-BR"/>
         </w:rPr>
-        <w:t xml:space="preserve"> Corrigi hoje os 63 pontos quebrados nas telas do cliente, mas </w:t>
-      </w:r>
-      <w:r>
-        <w:rPr>
-          <w:rFonts w:ascii="Calibri" w:hAnsi="Calibri" w:cs="Calibri"/>
-          <w:color w:val="1A1A1A"/>
-          <w:sz w:val="22"/>
-          <w:szCs w:val="22"/>
-          <w:lang w:val="pt-BR"/>
-        </w:rPr>
-        <w:t>restam cerca de 370 cores fixas do tema escuro espalhadas. O interruptor está em Configurações — o usuário vai usar.</w:t>
+        <w:t xml:space="preserve"> Corrigi hoje os 63 pontos quebrados nas telas do cliente, mas restam cerca de 370 cores fixas do tema escuro espalhadas. O interruptor está em Configurações — o usuário vai usar.</w:t>
       </w:r>
     </w:p>
     <w:p>
@@ -671,6 +968,7 @@
         </w:rPr>
         <w:t xml:space="preserve"> — o </w:t>
       </w:r>
+      <w:proofErr w:type="spellStart"/>
       <w:r>
         <w:rPr>
           <w:rStyle w:val="CdigoHTML"/>
@@ -679,6 +977,7 @@
         </w:rPr>
         <w:t>ReferenceError</w:t>
       </w:r>
+      <w:proofErr w:type="spellEnd"/>
       <w:r>
         <w:rPr>
           <w:rFonts w:ascii="Calibri" w:eastAsia="Times New Roman" w:hAnsi="Calibri" w:cs="Calibri"/>
@@ -725,7 +1024,29 @@
           <w:szCs w:val="22"/>
           <w:lang w:val="pt-BR"/>
         </w:rPr>
-        <w:t>, na camada de CSS em vez de ponto a ponto: duas regras reapontam as utilidades no tema claro. Trocar 63 classes à mão deixaria a mesma armadilha para o próximo componente escrito no idioma antigo. Só cor de texto muda; o tema escuro segue intacto.</w:t>
+        <w:t xml:space="preserve">, na camada de CSS em vez de ponto a ponto: duas regras </w:t>
+      </w:r>
+      <w:proofErr w:type="spellStart"/>
+      <w:r>
+        <w:rPr>
+          <w:rFonts w:ascii="Calibri" w:eastAsia="Times New Roman" w:hAnsi="Calibri" w:cs="Calibri"/>
+          <w:color w:val="1A1A1A"/>
+          <w:sz w:val="22"/>
+          <w:szCs w:val="22"/>
+          <w:lang w:val="pt-BR"/>
+        </w:rPr>
+        <w:t>reapontam</w:t>
+      </w:r>
+      <w:proofErr w:type="spellEnd"/>
+      <w:r>
+        <w:rPr>
+          <w:rFonts w:ascii="Calibri" w:eastAsia="Times New Roman" w:hAnsi="Calibri" w:cs="Calibri"/>
+          <w:color w:val="1A1A1A"/>
+          <w:sz w:val="22"/>
+          <w:szCs w:val="22"/>
+          <w:lang w:val="pt-BR"/>
+        </w:rPr>
+        <w:t xml:space="preserve"> as utilidades no tema claro. Trocar 63 classes à mão deixaria a mesma armadilha para o próximo componente escrito no idioma antigo. Só cor de texto muda; o tema escuro segue intacto.</w:t>
       </w:r>
     </w:p>
     <w:p>
@@ -743,6 +1064,7 @@
           <w:lang w:val="pt-BR"/>
         </w:rPr>
       </w:pPr>
+      <w:proofErr w:type="spellStart"/>
       <w:r>
         <w:rPr>
           <w:rFonts w:ascii="Calibri" w:eastAsia="Times New Roman" w:hAnsi="Calibri" w:cs="Calibri"/>
@@ -753,27 +1075,52 @@
           <w:szCs w:val="22"/>
           <w:lang w:val="pt-BR"/>
         </w:rPr>
-        <w:t>ESLint ligado</w:t>
-      </w:r>
-      <w:r>
-        <w:rPr>
-          <w:rFonts w:ascii="Calibri" w:eastAsia="Times New Roman" w:hAnsi="Calibri" w:cs="Calibri"/>
-          <w:color w:val="1A1A1A"/>
-          <w:sz w:val="22"/>
-          <w:szCs w:val="22"/>
-          <w:lang w:val="pt-BR"/>
-        </w:rPr>
-        <w:t xml:space="preserve"> — o script existia desde o início mas abortava por falta de</w:t>
-      </w:r>
-      <w:r>
-        <w:rPr>
-          <w:rFonts w:ascii="Calibri" w:eastAsia="Times New Roman" w:hAnsi="Calibri" w:cs="Calibri"/>
-          <w:color w:val="1A1A1A"/>
-          <w:sz w:val="22"/>
-          <w:szCs w:val="22"/>
-          <w:lang w:val="pt-BR"/>
-        </w:rPr>
-        <w:t xml:space="preserve"> configuração, e é por isso que aquele crash sobreviveu. Configurei separando o que quebra em execução (erro, barra) do que é dívida acumulada (aviso, aparece): 27 avisos hoje, quase todos código morto.</w:t>
+        <w:t>ESLint</w:t>
+      </w:r>
+      <w:proofErr w:type="spellEnd"/>
+      <w:r>
+        <w:rPr>
+          <w:rFonts w:ascii="Calibri" w:eastAsia="Times New Roman" w:hAnsi="Calibri" w:cs="Calibri"/>
+          <w:b/>
+          <w:bCs/>
+          <w:color w:val="1A1A1A"/>
+          <w:sz w:val="22"/>
+          <w:szCs w:val="22"/>
+          <w:lang w:val="pt-BR"/>
+        </w:rPr>
+        <w:t xml:space="preserve"> ligado</w:t>
+      </w:r>
+      <w:r>
+        <w:rPr>
+          <w:rFonts w:ascii="Calibri" w:eastAsia="Times New Roman" w:hAnsi="Calibri" w:cs="Calibri"/>
+          <w:color w:val="1A1A1A"/>
+          <w:sz w:val="22"/>
+          <w:szCs w:val="22"/>
+          <w:lang w:val="pt-BR"/>
+        </w:rPr>
+        <w:t xml:space="preserve"> — o script existia desde o </w:t>
+      </w:r>
+      <w:proofErr w:type="gramStart"/>
+      <w:r>
+        <w:rPr>
+          <w:rFonts w:ascii="Calibri" w:eastAsia="Times New Roman" w:hAnsi="Calibri" w:cs="Calibri"/>
+          <w:color w:val="1A1A1A"/>
+          <w:sz w:val="22"/>
+          <w:szCs w:val="22"/>
+          <w:lang w:val="pt-BR"/>
+        </w:rPr>
+        <w:t>início</w:t>
+      </w:r>
+      <w:proofErr w:type="gramEnd"/>
+      <w:r>
+        <w:rPr>
+          <w:rFonts w:ascii="Calibri" w:eastAsia="Times New Roman" w:hAnsi="Calibri" w:cs="Calibri"/>
+          <w:color w:val="1A1A1A"/>
+          <w:sz w:val="22"/>
+          <w:szCs w:val="22"/>
+          <w:lang w:val="pt-BR"/>
+        </w:rPr>
+        <w:t xml:space="preserve"> mas abortava por falta de configuração, e é por isso que aquele crash sobreviveu. Configurei separando o que quebra em execução (erro, barra) do que é dívida acumulada (aviso, aparece): 27 avisos hoje, quase todos código morto.</w:t>
       </w:r>
     </w:p>
     <w:p>
@@ -784,16 +1131,14 @@
           <w:color w:val="1A1A1A"/>
           <w:sz w:val="22"/>
           <w:szCs w:val="22"/>
-          <w:lang w:val="pt-BR"/>
-        </w:rPr>
-      </w:pPr>
-      <w:r>
-        <w:rPr>
-          <w:rFonts w:ascii="Calibri" w:hAnsi="Calibri" w:cs="Calibri"/>
-          <w:color w:val="1A1A1A"/>
-          <w:sz w:val="22"/>
-          <w:szCs w:val="22"/>
-          <w:lang w:val="pt-BR"/>
+        </w:rPr>
+      </w:pPr>
+      <w:r>
+        <w:rPr>
+          <w:rFonts w:ascii="Calibri" w:hAnsi="Calibri" w:cs="Calibri"/>
+          <w:color w:val="1A1A1A"/>
+          <w:sz w:val="22"/>
+          <w:szCs w:val="22"/>
         </w:rPr>
         <w:t xml:space="preserve">Commit </w:t>
       </w:r>
@@ -801,7 +1146,6 @@
         <w:rPr>
           <w:rStyle w:val="CdigoHTML"/>
           <w:color w:val="1A1A1A"/>
-          <w:lang w:val="pt-BR"/>
         </w:rPr>
         <w:t>6fe0294</w:t>
       </w:r>
@@ -811,15 +1155,33 @@
           <w:color w:val="1A1A1A"/>
           <w:sz w:val="22"/>
           <w:szCs w:val="22"/>
-          <w:lang w:val="pt-BR"/>
-        </w:rPr>
-        <w:t xml:space="preserve"> em </w:t>
+        </w:rPr>
+        <w:t xml:space="preserve"> </w:t>
+      </w:r>
+      <w:proofErr w:type="spellStart"/>
+      <w:r>
+        <w:rPr>
+          <w:rFonts w:ascii="Calibri" w:hAnsi="Calibri" w:cs="Calibri"/>
+          <w:color w:val="1A1A1A"/>
+          <w:sz w:val="22"/>
+          <w:szCs w:val="22"/>
+        </w:rPr>
+        <w:t>em</w:t>
+      </w:r>
+      <w:proofErr w:type="spellEnd"/>
+      <w:r>
+        <w:rPr>
+          <w:rFonts w:ascii="Calibri" w:hAnsi="Calibri" w:cs="Calibri"/>
+          <w:color w:val="1A1A1A"/>
+          <w:sz w:val="22"/>
+          <w:szCs w:val="22"/>
+        </w:rPr>
+        <w:t xml:space="preserve"> </w:t>
       </w:r>
       <w:r>
         <w:rPr>
           <w:rStyle w:val="CdigoHTML"/>
           <w:color w:val="1A1A1A"/>
-          <w:lang w:val="pt-BR"/>
         </w:rPr>
         <w:t>develop</w:t>
       </w:r>
@@ -829,9 +1191,28 @@
           <w:color w:val="1A1A1A"/>
           <w:sz w:val="22"/>
           <w:szCs w:val="22"/>
-          <w:lang w:val="pt-BR"/>
-        </w:rPr>
-        <w:t>. Build e lint passam.</w:t>
+        </w:rPr>
+        <w:t xml:space="preserve">. Build e lint </w:t>
+      </w:r>
+      <w:proofErr w:type="spellStart"/>
+      <w:r>
+        <w:rPr>
+          <w:rFonts w:ascii="Calibri" w:hAnsi="Calibri" w:cs="Calibri"/>
+          <w:color w:val="1A1A1A"/>
+          <w:sz w:val="22"/>
+          <w:szCs w:val="22"/>
+        </w:rPr>
+        <w:t>passam</w:t>
+      </w:r>
+      <w:proofErr w:type="spellEnd"/>
+      <w:r>
+        <w:rPr>
+          <w:rFonts w:ascii="Calibri" w:hAnsi="Calibri" w:cs="Calibri"/>
+          <w:color w:val="1A1A1A"/>
+          <w:sz w:val="22"/>
+          <w:szCs w:val="22"/>
+        </w:rPr>
+        <w:t>.</w:t>
       </w:r>
     </w:p>
     <w:p>
@@ -952,8 +1333,21 @@
                 <w:sz w:val="20"/>
                 <w:szCs w:val="20"/>
               </w:rPr>
-              <w:t>O que</w:t>
-            </w:r>
+              <w:t xml:space="preserve">O </w:t>
+            </w:r>
+            <w:proofErr w:type="spellStart"/>
+            <w:r>
+              <w:rPr>
+                <w:rFonts w:ascii="Calibri" w:eastAsia="Times New Roman" w:hAnsi="Calibri" w:cs="Calibri"/>
+                <w:b/>
+                <w:bCs/>
+                <w:color w:val="312E81"/>
+                <w:sz w:val="20"/>
+                <w:szCs w:val="20"/>
+              </w:rPr>
+              <w:t>que</w:t>
+            </w:r>
+            <w:proofErr w:type="spellEnd"/>
           </w:p>
         </w:tc>
         <w:tc>
@@ -996,7 +1390,31 @@
                 <w:sz w:val="20"/>
                 <w:szCs w:val="20"/>
               </w:rPr>
-              <w:t>Por que agora</w:t>
+              <w:t xml:space="preserve">Por </w:t>
+            </w:r>
+            <w:proofErr w:type="spellStart"/>
+            <w:r>
+              <w:rPr>
+                <w:rFonts w:ascii="Calibri" w:eastAsia="Times New Roman" w:hAnsi="Calibri" w:cs="Calibri"/>
+                <w:b/>
+                <w:bCs/>
+                <w:color w:val="312E81"/>
+                <w:sz w:val="20"/>
+                <w:szCs w:val="20"/>
+              </w:rPr>
+              <w:t>que</w:t>
+            </w:r>
+            <w:proofErr w:type="spellEnd"/>
+            <w:r>
+              <w:rPr>
+                <w:rFonts w:ascii="Calibri" w:eastAsia="Times New Roman" w:hAnsi="Calibri" w:cs="Calibri"/>
+                <w:b/>
+                <w:bCs/>
+                <w:color w:val="312E81"/>
+                <w:sz w:val="20"/>
+                <w:szCs w:val="20"/>
+              </w:rPr>
+              <w:t xml:space="preserve"> agora</w:t>
             </w:r>
           </w:p>
         </w:tc>
@@ -1031,6 +1449,7 @@
                 <w:szCs w:val="20"/>
               </w:rPr>
             </w:pPr>
+            <w:proofErr w:type="spellStart"/>
             <w:r>
               <w:rPr>
                 <w:rFonts w:ascii="Calibri" w:eastAsia="Times New Roman" w:hAnsi="Calibri" w:cs="Calibri"/>
@@ -1042,6 +1461,7 @@
               </w:rPr>
               <w:t>Esforço</w:t>
             </w:r>
+            <w:proofErr w:type="spellEnd"/>
           </w:p>
         </w:tc>
       </w:tr>
@@ -1109,6 +1529,7 @@
                 <w:color w:val="1A1A1A"/>
                 <w:sz w:val="20"/>
                 <w:szCs w:val="20"/>
+                <w:lang w:val="pt-BR"/>
               </w:rPr>
             </w:pPr>
             <w:r>
@@ -1117,6 +1538,7 @@
                 <w:color w:val="1A1A1A"/>
                 <w:sz w:val="20"/>
                 <w:szCs w:val="20"/>
+                <w:lang w:val="pt-BR"/>
               </w:rPr>
               <w:t xml:space="preserve">Configurar </w:t>
             </w:r>
@@ -1124,6 +1546,7 @@
               <w:rPr>
                 <w:rStyle w:val="CdigoHTML"/>
                 <w:color w:val="1A1A1A"/>
+                <w:lang w:val="pt-BR"/>
               </w:rPr>
               <w:t>VITE_SENTRY_DSN</w:t>
             </w:r>
@@ -1133,6 +1556,7 @@
                 <w:color w:val="1A1A1A"/>
                 <w:sz w:val="20"/>
                 <w:szCs w:val="20"/>
+                <w:lang w:val="pt-BR"/>
               </w:rPr>
               <w:t xml:space="preserve"> nos dois ambientes</w:t>
             </w:r>
@@ -1163,6 +1587,7 @@
                 <w:color w:val="1A1A1A"/>
                 <w:sz w:val="20"/>
                 <w:szCs w:val="20"/>
+                <w:lang w:val="pt-BR"/>
               </w:rPr>
             </w:pPr>
             <w:r>
@@ -1171,6 +1596,7 @@
                 <w:color w:val="1A1A1A"/>
                 <w:sz w:val="20"/>
                 <w:szCs w:val="20"/>
+                <w:lang w:val="pt-BR"/>
               </w:rPr>
               <w:t>Sem isso você não sabe que quebrou</w:t>
             </w:r>
@@ -1203,6 +1629,7 @@
                 <w:szCs w:val="20"/>
               </w:rPr>
             </w:pPr>
+            <w:proofErr w:type="spellStart"/>
             <w:r>
               <w:rPr>
                 <w:rFonts w:ascii="Calibri" w:eastAsia="Times New Roman" w:hAnsi="Calibri" w:cs="Calibri"/>
@@ -1212,6 +1639,7 @@
               </w:rPr>
               <w:t>minutos</w:t>
             </w:r>
+            <w:proofErr w:type="spellEnd"/>
           </w:p>
         </w:tc>
       </w:tr>
@@ -1288,7 +1716,27 @@
                 <w:sz w:val="20"/>
                 <w:szCs w:val="20"/>
               </w:rPr>
-              <w:t>CI no GitHub Actions rodando build + lint no PR</w:t>
+              <w:t xml:space="preserve">CI no GitHub Actions </w:t>
+            </w:r>
+            <w:proofErr w:type="spellStart"/>
+            <w:r>
+              <w:rPr>
+                <w:rFonts w:ascii="Calibri" w:eastAsia="Times New Roman" w:hAnsi="Calibri" w:cs="Calibri"/>
+                <w:color w:val="1A1A1A"/>
+                <w:sz w:val="20"/>
+                <w:szCs w:val="20"/>
+              </w:rPr>
+              <w:t>rodando</w:t>
+            </w:r>
+            <w:proofErr w:type="spellEnd"/>
+            <w:r>
+              <w:rPr>
+                <w:rFonts w:ascii="Calibri" w:eastAsia="Times New Roman" w:hAnsi="Calibri" w:cs="Calibri"/>
+                <w:color w:val="1A1A1A"/>
+                <w:sz w:val="20"/>
+                <w:szCs w:val="20"/>
+              </w:rPr>
+              <w:t xml:space="preserve"> build + lint no PR</w:t>
             </w:r>
           </w:p>
         </w:tc>
@@ -1317,6 +1765,7 @@
                 <w:color w:val="1A1A1A"/>
                 <w:sz w:val="20"/>
                 <w:szCs w:val="20"/>
+                <w:lang w:val="pt-BR"/>
               </w:rPr>
             </w:pPr>
             <w:r>
@@ -1325,6 +1774,7 @@
                 <w:color w:val="1A1A1A"/>
                 <w:sz w:val="20"/>
                 <w:szCs w:val="20"/>
+                <w:lang w:val="pt-BR"/>
               </w:rPr>
               <w:t>Impede regressão entrar sem ninguém ver</w:t>
             </w:r>
@@ -1433,6 +1883,7 @@
                 <w:color w:val="1A1A1A"/>
                 <w:sz w:val="20"/>
                 <w:szCs w:val="20"/>
+                <w:lang w:val="pt-BR"/>
               </w:rPr>
             </w:pPr>
             <w:r>
@@ -1441,9 +1892,22 @@
                 <w:color w:val="1A1A1A"/>
                 <w:sz w:val="20"/>
                 <w:szCs w:val="20"/>
-              </w:rPr>
-              <w:t>Testes nas partes que decidem acesso: permissões, RLS, isolamento entre tenants</w:t>
-            </w:r>
+                <w:lang w:val="pt-BR"/>
+              </w:rPr>
+              <w:t xml:space="preserve">Testes nas partes que decidem acesso: permissões, RLS, isolamento entre </w:t>
+            </w:r>
+            <w:proofErr w:type="spellStart"/>
+            <w:r>
+              <w:rPr>
+                <w:rFonts w:ascii="Calibri" w:eastAsia="Times New Roman" w:hAnsi="Calibri" w:cs="Calibri"/>
+                <w:color w:val="1A1A1A"/>
+                <w:sz w:val="20"/>
+                <w:szCs w:val="20"/>
+                <w:lang w:val="pt-BR"/>
+              </w:rPr>
+              <w:t>tenants</w:t>
+            </w:r>
+            <w:proofErr w:type="spellEnd"/>
           </w:p>
         </w:tc>
         <w:tc>
@@ -1471,6 +1935,7 @@
                 <w:color w:val="1A1A1A"/>
                 <w:sz w:val="20"/>
                 <w:szCs w:val="20"/>
+                <w:lang w:val="pt-BR"/>
               </w:rPr>
             </w:pPr>
             <w:r>
@@ -1479,6 +1944,7 @@
                 <w:color w:val="1A1A1A"/>
                 <w:sz w:val="20"/>
                 <w:szCs w:val="20"/>
+                <w:lang w:val="pt-BR"/>
               </w:rPr>
               <w:t>É onde um erro vira vazamento de dado de cliente</w:t>
             </w:r>
@@ -1511,6 +1977,7 @@
                 <w:szCs w:val="20"/>
               </w:rPr>
             </w:pPr>
+            <w:proofErr w:type="spellStart"/>
             <w:r>
               <w:rPr>
                 <w:rFonts w:ascii="Calibri" w:eastAsia="Times New Roman" w:hAnsi="Calibri" w:cs="Calibri"/>
@@ -1520,6 +1987,7 @@
               </w:rPr>
               <w:t>dias</w:t>
             </w:r>
+            <w:proofErr w:type="spellEnd"/>
           </w:p>
         </w:tc>
       </w:tr>
@@ -1587,6 +2055,7 @@
                 <w:color w:val="1A1A1A"/>
                 <w:sz w:val="20"/>
                 <w:szCs w:val="20"/>
+                <w:lang w:val="pt-BR"/>
               </w:rPr>
             </w:pPr>
             <w:r>
@@ -1595,8 +2064,31 @@
                 <w:color w:val="1A1A1A"/>
                 <w:sz w:val="20"/>
                 <w:szCs w:val="20"/>
-              </w:rPr>
-              <w:t>Zerar os 27 avisos do lint e subir as regras para erro</w:t>
+                <w:lang w:val="pt-BR"/>
+              </w:rPr>
+              <w:t xml:space="preserve">Zerar os 27 avisos do </w:t>
+            </w:r>
+            <w:proofErr w:type="spellStart"/>
+            <w:r>
+              <w:rPr>
+                <w:rFonts w:ascii="Calibri" w:eastAsia="Times New Roman" w:hAnsi="Calibri" w:cs="Calibri"/>
+                <w:color w:val="1A1A1A"/>
+                <w:sz w:val="20"/>
+                <w:szCs w:val="20"/>
+                <w:lang w:val="pt-BR"/>
+              </w:rPr>
+              <w:t>lint</w:t>
+            </w:r>
+            <w:proofErr w:type="spellEnd"/>
+            <w:r>
+              <w:rPr>
+                <w:rFonts w:ascii="Calibri" w:eastAsia="Times New Roman" w:hAnsi="Calibri" w:cs="Calibri"/>
+                <w:color w:val="1A1A1A"/>
+                <w:sz w:val="20"/>
+                <w:szCs w:val="20"/>
+                <w:lang w:val="pt-BR"/>
+              </w:rPr>
+              <w:t xml:space="preserve"> e subir as regras para erro</w:t>
             </w:r>
           </w:p>
         </w:tc>
@@ -1625,6 +2117,7 @@
                 <w:color w:val="1A1A1A"/>
                 <w:sz w:val="20"/>
                 <w:szCs w:val="20"/>
+                <w:lang w:val="pt-BR"/>
               </w:rPr>
             </w:pPr>
             <w:r>
@@ -1633,6 +2126,7 @@
                 <w:color w:val="1A1A1A"/>
                 <w:sz w:val="20"/>
                 <w:szCs w:val="20"/>
+                <w:lang w:val="pt-BR"/>
               </w:rPr>
               <w:t>Remove o ruído que esconde o próximo bug real</w:t>
             </w:r>
@@ -1672,8 +2166,19 @@
                 <w:sz w:val="20"/>
                 <w:szCs w:val="20"/>
               </w:rPr>
-              <w:t>~1 dia</w:t>
-            </w:r>
+              <w:t xml:space="preserve">~1 </w:t>
+            </w:r>
+            <w:proofErr w:type="spellStart"/>
+            <w:r>
+              <w:rPr>
+                <w:rFonts w:ascii="Calibri" w:eastAsia="Times New Roman" w:hAnsi="Calibri" w:cs="Calibri"/>
+                <w:color w:val="1A1A1A"/>
+                <w:sz w:val="20"/>
+                <w:szCs w:val="20"/>
+              </w:rPr>
+              <w:t>dia</w:t>
+            </w:r>
+            <w:proofErr w:type="spellEnd"/>
           </w:p>
         </w:tc>
       </w:tr>
@@ -1741,6 +2246,7 @@
                 <w:color w:val="1A1A1A"/>
                 <w:sz w:val="20"/>
                 <w:szCs w:val="20"/>
+                <w:lang w:val="pt-BR"/>
               </w:rPr>
             </w:pPr>
             <w:r>
@@ -1749,6 +2255,7 @@
                 <w:color w:val="1A1A1A"/>
                 <w:sz w:val="20"/>
                 <w:szCs w:val="20"/>
+                <w:lang w:val="pt-BR"/>
               </w:rPr>
               <w:t>Varrer as ~370 cores fixas restantes</w:t>
             </w:r>
@@ -1781,15 +2288,37 @@
                 <w:szCs w:val="20"/>
               </w:rPr>
             </w:pPr>
-            <w:r>
-              <w:rPr>
-                <w:rFonts w:ascii="Calibri" w:eastAsia="Times New Roman" w:hAnsi="Calibri" w:cs="Calibri"/>
-                <w:color w:val="1A1A1A"/>
-                <w:sz w:val="20"/>
-                <w:szCs w:val="20"/>
-              </w:rPr>
-              <w:t>Qualidade percebida</w:t>
-            </w:r>
+            <w:proofErr w:type="spellStart"/>
+            <w:r>
+              <w:rPr>
+                <w:rFonts w:ascii="Calibri" w:eastAsia="Times New Roman" w:hAnsi="Calibri" w:cs="Calibri"/>
+                <w:color w:val="1A1A1A"/>
+                <w:sz w:val="20"/>
+                <w:szCs w:val="20"/>
+              </w:rPr>
+              <w:t>Qualidade</w:t>
+            </w:r>
+            <w:proofErr w:type="spellEnd"/>
+            <w:r>
+              <w:rPr>
+                <w:rFonts w:ascii="Calibri" w:eastAsia="Times New Roman" w:hAnsi="Calibri" w:cs="Calibri"/>
+                <w:color w:val="1A1A1A"/>
+                <w:sz w:val="20"/>
+                <w:szCs w:val="20"/>
+              </w:rPr>
+              <w:t xml:space="preserve"> </w:t>
+            </w:r>
+            <w:proofErr w:type="spellStart"/>
+            <w:r>
+              <w:rPr>
+                <w:rFonts w:ascii="Calibri" w:eastAsia="Times New Roman" w:hAnsi="Calibri" w:cs="Calibri"/>
+                <w:color w:val="1A1A1A"/>
+                <w:sz w:val="20"/>
+                <w:szCs w:val="20"/>
+              </w:rPr>
+              <w:t>percebida</w:t>
+            </w:r>
+            <w:proofErr w:type="spellEnd"/>
           </w:p>
         </w:tc>
         <w:tc>
@@ -1819,6 +2348,7 @@
                 <w:szCs w:val="20"/>
               </w:rPr>
             </w:pPr>
+            <w:proofErr w:type="spellStart"/>
             <w:r>
               <w:rPr>
                 <w:rFonts w:ascii="Calibri" w:eastAsia="Times New Roman" w:hAnsi="Calibri" w:cs="Calibri"/>
@@ -1828,6 +2358,7 @@
               </w:rPr>
               <w:t>dias</w:t>
             </w:r>
+            <w:proofErr w:type="spellEnd"/>
           </w:p>
         </w:tc>
       </w:tr>
@@ -1895,12 +2426,14 @@
                 <w:color w:val="1A1A1A"/>
                 <w:sz w:val="20"/>
                 <w:szCs w:val="20"/>
+                <w:lang w:val="pt-BR"/>
               </w:rPr>
             </w:pPr>
             <w:r>
               <w:rPr>
                 <w:rStyle w:val="CdigoHTML"/>
                 <w:color w:val="1A1A1A"/>
+                <w:lang w:val="pt-BR"/>
               </w:rPr>
               <w:t>robots.txt</w:t>
             </w:r>
@@ -1910,9 +2443,44 @@
                 <w:color w:val="1A1A1A"/>
                 <w:sz w:val="20"/>
                 <w:szCs w:val="20"/>
-              </w:rPr>
-              <w:t xml:space="preserve"> com noindex no ambiente de dev</w:t>
-            </w:r>
+                <w:lang w:val="pt-BR"/>
+              </w:rPr>
+              <w:t xml:space="preserve"> com </w:t>
+            </w:r>
+            <w:proofErr w:type="spellStart"/>
+            <w:r>
+              <w:rPr>
+                <w:rFonts w:ascii="Calibri" w:eastAsia="Times New Roman" w:hAnsi="Calibri" w:cs="Calibri"/>
+                <w:color w:val="1A1A1A"/>
+                <w:sz w:val="20"/>
+                <w:szCs w:val="20"/>
+                <w:lang w:val="pt-BR"/>
+              </w:rPr>
+              <w:t>noindex</w:t>
+            </w:r>
+            <w:proofErr w:type="spellEnd"/>
+            <w:r>
+              <w:rPr>
+                <w:rFonts w:ascii="Calibri" w:eastAsia="Times New Roman" w:hAnsi="Calibri" w:cs="Calibri"/>
+                <w:color w:val="1A1A1A"/>
+                <w:sz w:val="20"/>
+                <w:szCs w:val="20"/>
+                <w:lang w:val="pt-BR"/>
+              </w:rPr>
+              <w:t xml:space="preserve"> no ambiente de </w:t>
+            </w:r>
+            <w:proofErr w:type="spellStart"/>
+            <w:r>
+              <w:rPr>
+                <w:rFonts w:ascii="Calibri" w:eastAsia="Times New Roman" w:hAnsi="Calibri" w:cs="Calibri"/>
+                <w:color w:val="1A1A1A"/>
+                <w:sz w:val="20"/>
+                <w:szCs w:val="20"/>
+                <w:lang w:val="pt-BR"/>
+              </w:rPr>
+              <w:t>dev</w:t>
+            </w:r>
+            <w:proofErr w:type="spellEnd"/>
           </w:p>
         </w:tc>
         <w:tc>
@@ -1940,6 +2508,7 @@
                 <w:color w:val="1A1A1A"/>
                 <w:sz w:val="20"/>
                 <w:szCs w:val="20"/>
+                <w:lang w:val="pt-BR"/>
               </w:rPr>
             </w:pPr>
             <w:r>
@@ -1948,6 +2517,7 @@
                 <w:color w:val="1A1A1A"/>
                 <w:sz w:val="20"/>
                 <w:szCs w:val="20"/>
+                <w:lang w:val="pt-BR"/>
               </w:rPr>
               <w:t>Ele está público e indexável hoje</w:t>
             </w:r>
@@ -1980,6 +2550,7 @@
                 <w:szCs w:val="20"/>
               </w:rPr>
             </w:pPr>
+            <w:proofErr w:type="spellStart"/>
             <w:r>
               <w:rPr>
                 <w:rFonts w:ascii="Calibri" w:eastAsia="Times New Roman" w:hAnsi="Calibri" w:cs="Calibri"/>
@@ -1989,6 +2560,7 @@
               </w:rPr>
               <w:t>minutos</w:t>
             </w:r>
+            <w:proofErr w:type="spellEnd"/>
           </w:p>
         </w:tc>
       </w:tr>
@@ -2012,17 +2584,7 @@
           <w:szCs w:val="22"/>
           <w:lang w:val="pt-BR"/>
         </w:rPr>
-        <w:t xml:space="preserve">Os itens 1, 2 e 6 somam menos de duas horas e mudam bastante o seu nível de segurança. O </w:t>
-      </w:r>
-      <w:r>
-        <w:rPr>
-          <w:rFonts w:ascii="Calibri" w:hAnsi="Calibri" w:cs="Calibri"/>
-          <w:color w:val="1A1A1A"/>
-          <w:sz w:val="22"/>
-          <w:szCs w:val="22"/>
-          <w:lang w:val="pt-BR"/>
-        </w:rPr>
-        <w:t>item 3 é o que separa "testável" de "vendável".</w:t>
+        <w:t>Os itens 1, 2 e 6 somam menos de duas horas e mudam bastante o seu nível de segurança. O item 3 é o que separa "testável" de "vendável".</w:t>
       </w:r>
     </w:p>
     <w:p>
@@ -2077,7 +2639,217 @@
           <w:szCs w:val="22"/>
           <w:lang w:val="pt-BR"/>
         </w:rPr>
-        <w:t xml:space="preserve"> Não verifiquei se há PITR ativo no plano do Supabase. Antes de ter cliente pagante, isso precisa estar respondido.</w:t>
+        <w:t xml:space="preserve"> Não verifiquei se há PITR ativo no plano do </w:t>
+      </w:r>
+      <w:proofErr w:type="spellStart"/>
+      <w:r>
+        <w:rPr>
+          <w:rFonts w:ascii="Calibri" w:eastAsia="Times New Roman" w:hAnsi="Calibri" w:cs="Calibri"/>
+          <w:color w:val="1A1A1A"/>
+          <w:sz w:val="22"/>
+          <w:szCs w:val="22"/>
+          <w:lang w:val="pt-BR"/>
+        </w:rPr>
+        <w:t>Supabase</w:t>
+      </w:r>
+      <w:proofErr w:type="spellEnd"/>
+      <w:r>
+        <w:rPr>
+          <w:rFonts w:ascii="Calibri" w:eastAsia="Times New Roman" w:hAnsi="Calibri" w:cs="Calibri"/>
+          <w:color w:val="1A1A1A"/>
+          <w:sz w:val="22"/>
+          <w:szCs w:val="22"/>
+          <w:lang w:val="pt-BR"/>
+        </w:rPr>
+        <w:t>. Antes de ter cliente pagante, isso precisa estar respondido.</w:t>
+      </w:r>
+      <w:r>
+        <w:rPr>
+          <w:rFonts w:ascii="Calibri" w:eastAsia="Times New Roman" w:hAnsi="Calibri" w:cs="Calibri"/>
+          <w:color w:val="1A1A1A"/>
+          <w:sz w:val="22"/>
+          <w:szCs w:val="22"/>
+          <w:lang w:val="pt-BR"/>
+        </w:rPr>
+        <w:br/>
+      </w:r>
+      <w:r>
+        <w:rPr>
+          <w:rFonts w:ascii="Calibri" w:eastAsia="Times New Roman" w:hAnsi="Calibri" w:cs="Calibri"/>
+          <w:color w:val="1A1A1A"/>
+          <w:sz w:val="22"/>
+          <w:szCs w:val="22"/>
+          <w:lang w:val="pt-BR"/>
+        </w:rPr>
+        <w:br/>
+      </w:r>
+      <w:r>
+        <w:rPr>
+          <w:rFonts w:ascii="Calibri" w:eastAsia="Times New Roman" w:hAnsi="Calibri" w:cs="Calibri"/>
+          <w:color w:val="1A1A1A"/>
+          <w:sz w:val="22"/>
+          <w:szCs w:val="22"/>
+          <w:highlight w:val="cyan"/>
+          <w:lang w:val="pt-BR"/>
+        </w:rPr>
+        <w:t>Isso basicamente significa que precisamos de alguma forma de backups automáticos,</w:t>
+      </w:r>
+      <w:r>
+        <w:rPr>
+          <w:rFonts w:ascii="Calibri" w:eastAsia="Times New Roman" w:hAnsi="Calibri" w:cs="Calibri"/>
+          <w:color w:val="1A1A1A"/>
+          <w:sz w:val="22"/>
+          <w:szCs w:val="22"/>
+          <w:highlight w:val="cyan"/>
+          <w:lang w:val="pt-BR"/>
+        </w:rPr>
+        <w:t xml:space="preserve"> o plano </w:t>
+      </w:r>
+      <w:proofErr w:type="spellStart"/>
+      <w:r>
+        <w:rPr>
+          <w:rFonts w:ascii="Calibri" w:eastAsia="Times New Roman" w:hAnsi="Calibri" w:cs="Calibri"/>
+          <w:color w:val="1A1A1A"/>
+          <w:sz w:val="22"/>
+          <w:szCs w:val="22"/>
+          <w:highlight w:val="cyan"/>
+          <w:lang w:val="pt-BR"/>
+        </w:rPr>
+        <w:t>free</w:t>
+      </w:r>
+      <w:proofErr w:type="spellEnd"/>
+      <w:r>
+        <w:rPr>
+          <w:rFonts w:ascii="Calibri" w:eastAsia="Times New Roman" w:hAnsi="Calibri" w:cs="Calibri"/>
+          <w:color w:val="1A1A1A"/>
+          <w:sz w:val="22"/>
+          <w:szCs w:val="22"/>
+          <w:highlight w:val="cyan"/>
+          <w:lang w:val="pt-BR"/>
+        </w:rPr>
+        <w:t xml:space="preserve"> do </w:t>
+      </w:r>
+      <w:proofErr w:type="spellStart"/>
+      <w:r>
+        <w:rPr>
+          <w:rFonts w:ascii="Calibri" w:eastAsia="Times New Roman" w:hAnsi="Calibri" w:cs="Calibri"/>
+          <w:color w:val="1A1A1A"/>
+          <w:sz w:val="22"/>
+          <w:szCs w:val="22"/>
+          <w:highlight w:val="cyan"/>
+          <w:lang w:val="pt-BR"/>
+        </w:rPr>
+        <w:t>Supabase</w:t>
+      </w:r>
+      <w:proofErr w:type="spellEnd"/>
+      <w:r>
+        <w:rPr>
+          <w:rFonts w:ascii="Calibri" w:eastAsia="Times New Roman" w:hAnsi="Calibri" w:cs="Calibri"/>
+          <w:color w:val="1A1A1A"/>
+          <w:sz w:val="22"/>
+          <w:szCs w:val="22"/>
+          <w:highlight w:val="cyan"/>
+          <w:lang w:val="pt-BR"/>
+        </w:rPr>
+        <w:t xml:space="preserve"> não tem essa opção. Teríamos que compra</w:t>
+      </w:r>
+      <w:r>
+        <w:rPr>
+          <w:rFonts w:ascii="Calibri" w:eastAsia="Times New Roman" w:hAnsi="Calibri" w:cs="Calibri"/>
+          <w:color w:val="1A1A1A"/>
+          <w:sz w:val="22"/>
+          <w:szCs w:val="22"/>
+          <w:highlight w:val="cyan"/>
+          <w:lang w:val="pt-BR"/>
+        </w:rPr>
+        <w:t>r</w:t>
+      </w:r>
+      <w:r>
+        <w:rPr>
+          <w:rFonts w:ascii="Calibri" w:eastAsia="Times New Roman" w:hAnsi="Calibri" w:cs="Calibri"/>
+          <w:color w:val="1A1A1A"/>
+          <w:sz w:val="22"/>
+          <w:szCs w:val="22"/>
+          <w:highlight w:val="cyan"/>
+          <w:lang w:val="pt-BR"/>
+        </w:rPr>
+        <w:t xml:space="preserve"> o plano </w:t>
+      </w:r>
+      <w:r>
+        <w:rPr>
+          <w:rFonts w:ascii="Calibri" w:eastAsia="Times New Roman" w:hAnsi="Calibri" w:cs="Calibri"/>
+          <w:color w:val="1A1A1A"/>
+          <w:sz w:val="22"/>
+          <w:szCs w:val="22"/>
+          <w:highlight w:val="cyan"/>
+          <w:lang w:val="pt-BR"/>
+        </w:rPr>
+        <w:t>“</w:t>
+      </w:r>
+      <w:r>
+        <w:rPr>
+          <w:rFonts w:ascii="Calibri" w:eastAsia="Times New Roman" w:hAnsi="Calibri" w:cs="Calibri"/>
+          <w:color w:val="1A1A1A"/>
+          <w:sz w:val="22"/>
+          <w:szCs w:val="22"/>
+          <w:highlight w:val="cyan"/>
+          <w:lang w:val="pt-BR"/>
+        </w:rPr>
+        <w:t>Pro</w:t>
+      </w:r>
+      <w:r>
+        <w:rPr>
+          <w:rFonts w:ascii="Calibri" w:eastAsia="Times New Roman" w:hAnsi="Calibri" w:cs="Calibri"/>
+          <w:color w:val="1A1A1A"/>
+          <w:sz w:val="22"/>
+          <w:szCs w:val="22"/>
+          <w:highlight w:val="cyan"/>
+          <w:lang w:val="pt-BR"/>
+        </w:rPr>
+        <w:t>”</w:t>
+      </w:r>
+      <w:r>
+        <w:rPr>
+          <w:rFonts w:ascii="Calibri" w:eastAsia="Times New Roman" w:hAnsi="Calibri" w:cs="Calibri"/>
+          <w:color w:val="1A1A1A"/>
+          <w:sz w:val="22"/>
+          <w:szCs w:val="22"/>
+          <w:highlight w:val="cyan"/>
+          <w:lang w:val="pt-BR"/>
+        </w:rPr>
+        <w:t xml:space="preserve"> para obter </w:t>
+      </w:r>
+      <w:r>
+        <w:rPr>
+          <w:rFonts w:ascii="Calibri" w:eastAsia="Times New Roman" w:hAnsi="Calibri" w:cs="Calibri"/>
+          <w:color w:val="1A1A1A"/>
+          <w:sz w:val="22"/>
+          <w:szCs w:val="22"/>
+          <w:highlight w:val="cyan"/>
+          <w:lang w:val="pt-BR"/>
+        </w:rPr>
+        <w:t>esses backups automáticos diários para o banco de produção antes de vender. Não podemos vender sem isso</w:t>
+      </w:r>
+      <w:r>
+        <w:rPr>
+          <w:rFonts w:ascii="Calibri" w:eastAsia="Times New Roman" w:hAnsi="Calibri" w:cs="Calibri"/>
+          <w:color w:val="1A1A1A"/>
+          <w:sz w:val="22"/>
+          <w:szCs w:val="22"/>
+          <w:highlight w:val="cyan"/>
+          <w:lang w:val="pt-BR"/>
+        </w:rPr>
+        <w:t>, pois afeta diretamente a LGPD e integridade de dados.</w:t>
+      </w:r>
+      <w:r>
+        <w:rPr>
+          <w:rFonts w:ascii="Calibri" w:eastAsia="Times New Roman" w:hAnsi="Calibri" w:cs="Calibri"/>
+          <w:color w:val="1A1A1A"/>
+          <w:sz w:val="22"/>
+          <w:szCs w:val="22"/>
+          <w:lang w:val="pt-BR"/>
+        </w:rPr>
+        <w:br/>
       </w:r>
     </w:p>
     <w:p>

</xml_diff>